<commit_message>
fixing the questions to be right
</commit_message>
<xml_diff>
--- a/data/templates/cw74.docx
+++ b/data/templates/cw74.docx
@@ -209,9 +209,6 @@
                                       <w:sz w:val="14"/>
                                     </w:rPr>
                                     <w:t> Phone:</w:t>
-                                  </w:r>
-                                  <w:r>
-                                    <w:t xml:space="preserve"> {{cw74__phone}}</w:t>
                                   </w:r>
                                 </w:p>
                               </w:tc>
@@ -1841,9 +1838,6 @@
                                       <w:sz w:val="18"/>
                                     </w:rPr>
                                     <w:t>Address</w:t>
-                                  </w:r>
-                                  <w:r>
-                                    <w:t xml:space="preserve"> {{cw74__address}}</w:t>
                                   </w:r>
                                 </w:p>
                               </w:tc>

</xml_diff>